<commit_message>
Diagrama roadmap añadido + Actualización documentos - Jaime Vergara
</commit_message>
<xml_diff>
--- a/documentos/Especificación_Casos_de_Uso_Martech.docx
+++ b/documentos/Especificación_Casos_de_Uso_Martech.docx
@@ -775,7 +775,7 @@
     </w:p>
     <w:sdt>
       <w:sdtPr>
-        <w:id w:val="-357376943"/>
+        <w:id w:val="1184711767"/>
         <w:docPartObj>
           <w:docPartGallery w:val="Table of Contents"/>
           <w:docPartUnique w:val="1"/>
@@ -2138,45 +2138,36 @@
           </w:tcPr>
           <w:p>
             <w:pPr>
-              <w:spacing w:after="0" w:line="240" w:lineRule="auto"/>
+              <w:keepNext w:val="0"/>
+              <w:keepLines w:val="0"/>
+              <w:widowControl w:val="1"/>
+              <w:pBdr>
+                <w:top w:space="0" w:sz="0" w:val="nil"/>
+                <w:left w:space="0" w:sz="0" w:val="nil"/>
+                <w:bottom w:space="0" w:sz="0" w:val="nil"/>
+                <w:right w:space="0" w:sz="0" w:val="nil"/>
+                <w:between w:space="0" w:sz="0" w:val="nil"/>
+              </w:pBdr>
+              <w:shd w:fill="auto" w:val="clear"/>
+              <w:spacing w:after="0" w:before="0" w:line="240" w:lineRule="auto"/>
+              <w:ind w:left="0" w:right="0" w:firstLine="0"/>
               <w:jc w:val="center"/>
               <w:rPr>
-                <w:b w:val="0"/>
-                <w:bCs w:val="0"/>
-                <w:color w:val="000000"/>
+                <w:b w:val="1"/>
+                <w:bCs w:val="1"/>
                 <w:sz w:val="20"/>
                 <w:szCs w:val="20"/>
-                <w:vertAlign w:val="baseline"/>
-              </w:rPr>
-            </w:pPr>
-            <w:r>
-              <w:rPr>
-                <w:rtl w:val="0"/>
-              </w:rPr>
-            </w:r>
-          </w:p>
-        </w:tc>
-        <w:tc>
-          <w:tcPr>
-            <w:vAlign w:val="top"/>
-          </w:tcPr>
-          <w:p>
-            <w:pPr>
-              <w:spacing w:after="0" w:line="240" w:lineRule="auto"/>
-              <w:jc w:val="center"/>
-              <w:rPr>
-                <w:b w:val="0"/>
-                <w:bCs w:val="0"/>
-                <w:color w:val="000000"/>
+              </w:rPr>
+            </w:pPr>
+            <w:r>
+              <w:rPr>
+                <w:b w:val="1"/>
+                <w:bCs w:val="1"/>
                 <w:sz w:val="20"/>
                 <w:szCs w:val="20"/>
-                <w:vertAlign w:val="baseline"/>
-              </w:rPr>
-            </w:pPr>
-            <w:r>
-              <w:rPr>
-                <w:rtl w:val="0"/>
-              </w:rPr>
+                <w:rtl w:val="0"/>
+              </w:rPr>
+              <w:t xml:space="preserve">05/09/26</w:t>
             </w:r>
           </w:p>
         </w:tc>
@@ -2186,45 +2177,36 @@
           </w:tcPr>
           <w:p>
             <w:pPr>
-              <w:spacing w:after="0" w:line="240" w:lineRule="auto"/>
+              <w:keepNext w:val="0"/>
+              <w:keepLines w:val="0"/>
+              <w:widowControl w:val="1"/>
+              <w:pBdr>
+                <w:top w:space="0" w:sz="0" w:val="nil"/>
+                <w:left w:space="0" w:sz="0" w:val="nil"/>
+                <w:bottom w:space="0" w:sz="0" w:val="nil"/>
+                <w:right w:space="0" w:sz="0" w:val="nil"/>
+                <w:between w:space="0" w:sz="0" w:val="nil"/>
+              </w:pBdr>
+              <w:shd w:fill="auto" w:val="clear"/>
+              <w:spacing w:after="0" w:before="0" w:line="240" w:lineRule="auto"/>
+              <w:ind w:left="0" w:right="0" w:firstLine="0"/>
               <w:jc w:val="center"/>
               <w:rPr>
-                <w:b w:val="0"/>
-                <w:bCs w:val="0"/>
-                <w:color w:val="000000"/>
+                <w:b w:val="1"/>
+                <w:bCs w:val="1"/>
                 <w:sz w:val="20"/>
                 <w:szCs w:val="20"/>
-                <w:vertAlign w:val="baseline"/>
-              </w:rPr>
-            </w:pPr>
-            <w:r>
-              <w:rPr>
-                <w:rtl w:val="0"/>
-              </w:rPr>
-            </w:r>
-          </w:p>
-        </w:tc>
-        <w:tc>
-          <w:tcPr>
-            <w:vAlign w:val="top"/>
-          </w:tcPr>
-          <w:p>
-            <w:pPr>
-              <w:spacing w:after="0" w:line="240" w:lineRule="auto"/>
-              <w:jc w:val="center"/>
-              <w:rPr>
-                <w:b w:val="0"/>
-                <w:bCs w:val="0"/>
-                <w:color w:val="000000"/>
+              </w:rPr>
+            </w:pPr>
+            <w:r>
+              <w:rPr>
+                <w:b w:val="1"/>
+                <w:bCs w:val="1"/>
                 <w:sz w:val="20"/>
                 <w:szCs w:val="20"/>
-                <w:vertAlign w:val="baseline"/>
-              </w:rPr>
-            </w:pPr>
-            <w:r>
-              <w:rPr>
-                <w:rtl w:val="0"/>
-              </w:rPr>
+                <w:rtl w:val="0"/>
+              </w:rPr>
+              <w:t xml:space="preserve">3.0</w:t>
             </w:r>
           </w:p>
         </w:tc>
@@ -2234,21 +2216,114 @@
           </w:tcPr>
           <w:p>
             <w:pPr>
-              <w:spacing w:after="0" w:line="240" w:lineRule="auto"/>
+              <w:keepNext w:val="0"/>
+              <w:keepLines w:val="0"/>
+              <w:widowControl w:val="1"/>
+              <w:pBdr>
+                <w:top w:space="0" w:sz="0" w:val="nil"/>
+                <w:left w:space="0" w:sz="0" w:val="nil"/>
+                <w:bottom w:space="0" w:sz="0" w:val="nil"/>
+                <w:right w:space="0" w:sz="0" w:val="nil"/>
+                <w:between w:space="0" w:sz="0" w:val="nil"/>
+              </w:pBdr>
+              <w:shd w:fill="auto" w:val="clear"/>
+              <w:spacing w:after="0" w:before="0" w:line="240" w:lineRule="auto"/>
+              <w:ind w:left="0" w:right="0" w:firstLine="0"/>
               <w:jc w:val="center"/>
               <w:rPr>
-                <w:b w:val="0"/>
-                <w:bCs w:val="0"/>
-                <w:color w:val="000000"/>
+                <w:b w:val="1"/>
+                <w:bCs w:val="1"/>
                 <w:sz w:val="20"/>
                 <w:szCs w:val="20"/>
-                <w:vertAlign w:val="baseline"/>
-              </w:rPr>
-            </w:pPr>
-            <w:r>
-              <w:rPr>
-                <w:rtl w:val="0"/>
-              </w:rPr>
+              </w:rPr>
+            </w:pPr>
+            <w:r>
+              <w:rPr>
+                <w:b w:val="1"/>
+                <w:bCs w:val="1"/>
+                <w:sz w:val="20"/>
+                <w:szCs w:val="20"/>
+                <w:rtl w:val="0"/>
+              </w:rPr>
+              <w:t xml:space="preserve">Rodrigo Urbina</w:t>
+            </w:r>
+          </w:p>
+        </w:tc>
+        <w:tc>
+          <w:tcPr>
+            <w:vAlign w:val="top"/>
+          </w:tcPr>
+          <w:p>
+            <w:pPr>
+              <w:keepNext w:val="0"/>
+              <w:keepLines w:val="0"/>
+              <w:widowControl w:val="1"/>
+              <w:pBdr>
+                <w:top w:space="0" w:sz="0" w:val="nil"/>
+                <w:left w:space="0" w:sz="0" w:val="nil"/>
+                <w:bottom w:space="0" w:sz="0" w:val="nil"/>
+                <w:right w:space="0" w:sz="0" w:val="nil"/>
+                <w:between w:space="0" w:sz="0" w:val="nil"/>
+              </w:pBdr>
+              <w:shd w:fill="auto" w:val="clear"/>
+              <w:spacing w:after="0" w:before="0" w:line="240" w:lineRule="auto"/>
+              <w:ind w:left="0" w:right="0" w:firstLine="0"/>
+              <w:jc w:val="center"/>
+              <w:rPr>
+                <w:b w:val="1"/>
+                <w:bCs w:val="1"/>
+                <w:sz w:val="20"/>
+                <w:szCs w:val="20"/>
+              </w:rPr>
+            </w:pPr>
+            <w:r>
+              <w:rPr>
+                <w:b w:val="1"/>
+                <w:bCs w:val="1"/>
+                <w:sz w:val="20"/>
+                <w:szCs w:val="20"/>
+                <w:rtl w:val="0"/>
+              </w:rPr>
+              <w:t xml:space="preserve">MarTech</w:t>
+            </w:r>
+          </w:p>
+        </w:tc>
+        <w:tc>
+          <w:tcPr>
+            <w:vAlign w:val="top"/>
+          </w:tcPr>
+          <w:p>
+            <w:pPr>
+              <w:keepNext w:val="0"/>
+              <w:keepLines w:val="0"/>
+              <w:widowControl w:val="1"/>
+              <w:pBdr>
+                <w:top w:space="0" w:sz="0" w:val="nil"/>
+                <w:left w:space="0" w:sz="0" w:val="nil"/>
+                <w:bottom w:space="0" w:sz="0" w:val="nil"/>
+                <w:right w:space="0" w:sz="0" w:val="nil"/>
+                <w:between w:space="0" w:sz="0" w:val="nil"/>
+              </w:pBdr>
+              <w:shd w:fill="auto" w:val="clear"/>
+              <w:spacing w:after="0" w:before="0" w:line="240" w:lineRule="auto"/>
+              <w:ind w:left="0" w:right="0" w:firstLine="0"/>
+              <w:jc w:val="center"/>
+              <w:rPr>
+                <w:b w:val="1"/>
+                <w:bCs w:val="1"/>
+                <w:sz w:val="20"/>
+                <w:szCs w:val="20"/>
+              </w:rPr>
+            </w:pPr>
+            <w:r>
+              <w:rPr>
+                <w:b w:val="1"/>
+                <w:bCs w:val="1"/>
+                <w:sz w:val="20"/>
+                <w:szCs w:val="20"/>
+                <w:rtl w:val="0"/>
+              </w:rPr>
+              <w:t xml:space="preserve">Incorporación Casos de uso C15-C18</w:t>
             </w:r>
           </w:p>
         </w:tc>
@@ -3302,7 +3377,7 @@
             </w:pPr>
             <w:sdt>
               <w:sdtPr>
-                <w:id w:val="1798421499"/>
+                <w:id w:val="233323428"/>
                 <w:tag w:val="goog_rdk_0"/>
               </w:sdtPr>
               <w:sdtContent>
@@ -3354,7 +3429,7 @@
             </w:pPr>
             <w:sdt>
               <w:sdtPr>
-                <w:id w:val="1524483230"/>
+                <w:id w:val="1086797205"/>
                 <w:tag w:val="goog_rdk_1"/>
               </w:sdtPr>
               <w:sdtContent>
@@ -3408,7 +3483,7 @@
               <w:rPr>
                 <w:rtl w:val="0"/>
               </w:rPr>
-              <w:t xml:space="preserve">C03, C04, C05, C10, C11, C12, C14.</w:t>
+              <w:t xml:space="preserve">C03, C04, C05, C10, C11, C12, C14, C17, C18.</w:t>
             </w:r>
           </w:p>
         </w:tc>
@@ -4044,7 +4119,7 @@
               <w:rPr>
                 <w:rtl w:val="0"/>
               </w:rPr>
-              <w:t xml:space="preserve">C05, C08, C09, C13.</w:t>
+              <w:t xml:space="preserve">C05, C08, C09, C13, C15, C16.</w:t>
             </w:r>
           </w:p>
         </w:tc>
@@ -6010,7 +6085,7 @@
               <w:rPr>
                 <w:rtl w:val="0"/>
               </w:rPr>
-              <w:t xml:space="preserve">C10, C11, C12</w:t>
+              <w:t xml:space="preserve">C10, C11, C12, C16, C17</w:t>
             </w:r>
           </w:p>
         </w:tc>
@@ -6415,7 +6490,7 @@
               <w:rPr>
                 <w:rtl w:val="0"/>
               </w:rPr>
-              <w:t xml:space="preserve">C08, C09, C10, C11</w:t>
+              <w:t xml:space="preserve">C08, C09, C10, C11, C15</w:t>
             </w:r>
           </w:p>
         </w:tc>
@@ -10552,6 +10627,1257 @@
         <w:spacing w:after="0" w:before="0" w:line="276" w:lineRule="auto"/>
         <w:ind w:left="0" w:right="0" w:firstLine="0"/>
         <w:jc w:val="left"/>
+        <w:rPr/>
+      </w:pPr>
+      <w:r>
+        <w:rPr>
+          <w:rtl w:val="0"/>
+        </w:rPr>
+      </w:r>
+    </w:p>
+    <w:p>
+      <w:pPr>
+        <w:widowControl w:val="0"/>
+        <w:spacing w:after="0" w:line="276" w:lineRule="auto"/>
+        <w:rPr/>
+      </w:pPr>
+      <w:r>
+        <w:rPr>
+          <w:rtl w:val="0"/>
+        </w:rPr>
+      </w:r>
+    </w:p>
+    <w:p>
+      <w:pPr>
+        <w:rPr/>
+      </w:pPr>
+      <w:r>
+        <w:rPr>
+          <w:rtl w:val="0"/>
+        </w:rPr>
+      </w:r>
+    </w:p>
+    <w:p>
+      <w:pPr>
+        <w:rPr>
+          <w:b w:val="1"/>
+          <w:bCs w:val="1"/>
+        </w:rPr>
+      </w:pPr>
+      <w:r>
+        <w:br w:type="page"/>
+      </w:r>
+      <w:r>
+        <w:rPr>
+          <w:rtl w:val="0"/>
+        </w:rPr>
+      </w:r>
+    </w:p>
+    <w:p>
+      <w:pPr>
+        <w:rPr>
+          <w:b w:val="1"/>
+          <w:bCs w:val="1"/>
+        </w:rPr>
+      </w:pPr>
+      <w:r>
+        <w:rPr>
+          <w:b w:val="1"/>
+          <w:bCs w:val="1"/>
+          <w:rtl w:val="0"/>
+        </w:rPr>
+        <w:t xml:space="preserve">Incorporar eventos de comportamiento web</w:t>
+      </w:r>
+    </w:p>
+    <w:sdt>
+      <w:sdtPr>
+        <w:lock w:val="contentLocked"/>
+        <w:id w:val="1580390883"/>
+        <w:tag w:val="goog_rdk_2"/>
+      </w:sdtPr>
+      <w:sdtContent>
+        <w:tbl>
+          <w:tblPr>
+            <w:tblStyle w:val="Table21"/>
+            <w:tblW w:w="8820.0" w:type="dxa"/>
+            <w:jc w:val="left"/>
+            <w:tblBorders>
+              <w:top w:color="000000" w:space="0" w:sz="8" w:val="single"/>
+              <w:left w:color="000000" w:space="0" w:sz="8" w:val="single"/>
+              <w:bottom w:color="000000" w:space="0" w:sz="8" w:val="single"/>
+              <w:right w:color="000000" w:space="0" w:sz="8" w:val="single"/>
+              <w:insideH w:color="000000" w:space="0" w:sz="8" w:val="single"/>
+              <w:insideV w:color="000000" w:space="0" w:sz="8" w:val="single"/>
+            </w:tblBorders>
+            <w:tblLayout w:type="fixed"/>
+            <w:tblLook w:val="0400"/>
+          </w:tblPr>
+          <w:tblGrid>
+            <w:gridCol w:w="1995"/>
+            <w:gridCol w:w="3885"/>
+            <w:gridCol w:w="2940"/>
+            <w:tblGridChange w:id="0">
+              <w:tblGrid>
+                <w:gridCol w:w="1995"/>
+                <w:gridCol w:w="3885"/>
+                <w:gridCol w:w="2940"/>
+              </w:tblGrid>
+            </w:tblGridChange>
+          </w:tblGrid>
+          <w:tr>
+            <w:trPr>
+              <w:cantSplit w:val="0"/>
+              <w:tblHeader w:val="0"/>
+            </w:trPr>
+            <w:tc>
+              <w:tcPr/>
+              <w:p>
+                <w:pPr>
+                  <w:rPr/>
+                </w:pPr>
+                <w:r>
+                  <w:rPr>
+                    <w:b w:val="1"/>
+                    <w:bCs w:val="1"/>
+                    <w:rtl w:val="0"/>
+                  </w:rPr>
+                  <w:t xml:space="preserve">Caso de Uso</w:t>
+                </w:r>
+                <w:r>
+                  <w:rPr>
+                    <w:rtl w:val="0"/>
+                  </w:rPr>
+                </w:r>
+              </w:p>
+            </w:tc>
+            <w:tc>
+              <w:tcPr/>
+              <w:p>
+                <w:pPr>
+                  <w:rPr/>
+                </w:pPr>
+                <w:r>
+                  <w:rPr>
+                    <w:rtl w:val="0"/>
+                  </w:rPr>
+                  <w:t xml:space="preserve">Incorporar eventos de comportamiento web </w:t>
+                </w:r>
+              </w:p>
+            </w:tc>
+            <w:tc>
+              <w:tcPr/>
+              <w:p>
+                <w:pPr>
+                  <w:rPr/>
+                </w:pPr>
+                <w:r>
+                  <w:rPr>
+                    <w:rtl w:val="0"/>
+                  </w:rPr>
+                  <w:t xml:space="preserve">Identificador:</w:t>
+                  <w:br w:type="textWrapping"/>
+                  <w:t xml:space="preserve">C15</w:t>
+                </w:r>
+              </w:p>
+            </w:tc>
+          </w:tr>
+          <w:tr>
+            <w:trPr>
+              <w:cantSplit w:val="0"/>
+              <w:trHeight w:val="240" w:hRule="atLeast"/>
+              <w:tblHeader w:val="0"/>
+            </w:trPr>
+            <w:tc>
+              <w:tcPr/>
+              <w:p>
+                <w:pPr>
+                  <w:rPr/>
+                </w:pPr>
+                <w:r>
+                  <w:rPr>
+                    <w:b w:val="1"/>
+                    <w:bCs w:val="1"/>
+                    <w:rtl w:val="0"/>
+                  </w:rPr>
+                  <w:t xml:space="preserve">Actores</w:t>
+                </w:r>
+                <w:r>
+                  <w:rPr>
+                    <w:rtl w:val="0"/>
+                  </w:rPr>
+                </w:r>
+              </w:p>
+            </w:tc>
+            <w:tc>
+              <w:tcPr>
+                <w:gridSpan w:val="2"/>
+              </w:tcPr>
+              <w:p>
+                <w:pPr>
+                  <w:rPr/>
+                </w:pPr>
+                <w:r>
+                  <w:rPr>
+                    <w:rtl w:val="0"/>
+                  </w:rPr>
+                  <w:t xml:space="preserve">ACT-03 (a través de C05) </w:t>
+                </w:r>
+              </w:p>
+            </w:tc>
+          </w:tr>
+          <w:tr>
+            <w:trPr>
+              <w:cantSplit w:val="0"/>
+              <w:trHeight w:val="240" w:hRule="atLeast"/>
+              <w:tblHeader w:val="0"/>
+            </w:trPr>
+            <w:tc>
+              <w:tcPr/>
+              <w:p>
+                <w:pPr>
+                  <w:rPr/>
+                </w:pPr>
+                <w:r>
+                  <w:rPr>
+                    <w:b w:val="1"/>
+                    <w:bCs w:val="1"/>
+                    <w:rtl w:val="0"/>
+                  </w:rPr>
+                  <w:t xml:space="preserve">Tipo</w:t>
+                </w:r>
+                <w:r>
+                  <w:rPr>
+                    <w:rtl w:val="0"/>
+                  </w:rPr>
+                </w:r>
+              </w:p>
+            </w:tc>
+            <w:tc>
+              <w:tcPr>
+                <w:gridSpan w:val="2"/>
+              </w:tcPr>
+              <w:p>
+                <w:pPr>
+                  <w:rPr/>
+                </w:pPr>
+                <w:r>
+                  <w:rPr>
+                    <w:rtl w:val="0"/>
+                  </w:rPr>
+                  <w:t xml:space="preserve">Secundario 1er nivel (Include) </w:t>
+                </w:r>
+              </w:p>
+            </w:tc>
+          </w:tr>
+          <w:tr>
+            <w:trPr>
+              <w:cantSplit w:val="0"/>
+              <w:trHeight w:val="240" w:hRule="atLeast"/>
+              <w:tblHeader w:val="0"/>
+            </w:trPr>
+            <w:tc>
+              <w:tcPr/>
+              <w:p>
+                <w:pPr>
+                  <w:rPr/>
+                </w:pPr>
+                <w:r>
+                  <w:rPr>
+                    <w:b w:val="1"/>
+                    <w:bCs w:val="1"/>
+                    <w:rtl w:val="0"/>
+                  </w:rPr>
+                  <w:t xml:space="preserve">Referencias</w:t>
+                </w:r>
+                <w:r>
+                  <w:rPr>
+                    <w:rtl w:val="0"/>
+                  </w:rPr>
+                </w:r>
+              </w:p>
+            </w:tc>
+            <w:tc>
+              <w:tcPr>
+                <w:gridSpan w:val="2"/>
+              </w:tcPr>
+              <w:p>
+                <w:pPr>
+                  <w:rPr/>
+                </w:pPr>
+                <w:r>
+                  <w:rPr>
+                    <w:rtl w:val="0"/>
+                  </w:rPr>
+                  <w:t xml:space="preserve">C05</w:t>
+                </w:r>
+              </w:p>
+            </w:tc>
+          </w:tr>
+          <w:tr>
+            <w:trPr>
+              <w:cantSplit w:val="0"/>
+              <w:trHeight w:val="240" w:hRule="atLeast"/>
+              <w:tblHeader w:val="0"/>
+            </w:trPr>
+            <w:tc>
+              <w:tcPr/>
+              <w:p>
+                <w:pPr>
+                  <w:rPr/>
+                </w:pPr>
+                <w:r>
+                  <w:rPr>
+                    <w:b w:val="1"/>
+                    <w:bCs w:val="1"/>
+                    <w:rtl w:val="0"/>
+                  </w:rPr>
+                  <w:t xml:space="preserve">Precondición</w:t>
+                </w:r>
+                <w:r>
+                  <w:rPr>
+                    <w:rtl w:val="0"/>
+                  </w:rPr>
+                </w:r>
+              </w:p>
+            </w:tc>
+            <w:tc>
+              <w:tcPr>
+                <w:gridSpan w:val="2"/>
+              </w:tcPr>
+              <w:p>
+                <w:pPr>
+                  <w:rPr/>
+                </w:pPr>
+                <w:r>
+                  <w:rPr>
+                    <w:rtl w:val="0"/>
+                  </w:rPr>
+                  <w:t xml:space="preserve">Exportación nativa de la plataforma de analítica web habilitada hacia el ambiente de datos. </w:t>
+                </w:r>
+              </w:p>
+            </w:tc>
+          </w:tr>
+          <w:tr>
+            <w:trPr>
+              <w:cantSplit w:val="0"/>
+              <w:trHeight w:val="240" w:hRule="atLeast"/>
+              <w:tblHeader w:val="0"/>
+            </w:trPr>
+            <w:tc>
+              <w:tcPr/>
+              <w:p>
+                <w:pPr>
+                  <w:rPr/>
+                </w:pPr>
+                <w:r>
+                  <w:rPr>
+                    <w:b w:val="1"/>
+                    <w:bCs w:val="1"/>
+                    <w:rtl w:val="0"/>
+                  </w:rPr>
+                  <w:t xml:space="preserve">Postcondición</w:t>
+                </w:r>
+                <w:r>
+                  <w:rPr>
+                    <w:rtl w:val="0"/>
+                  </w:rPr>
+                </w:r>
+              </w:p>
+            </w:tc>
+            <w:tc>
+              <w:tcPr>
+                <w:gridSpan w:val="2"/>
+              </w:tcPr>
+              <w:p>
+                <w:pPr>
+                  <w:rPr/>
+                </w:pPr>
+                <w:r>
+                  <w:rPr>
+                    <w:rtl w:val="0"/>
+                  </w:rPr>
+                  <w:t xml:space="preserve">Eventos de navegación incorporados a las capas de análisis y disponibles para su cruce con datos transaccionales y de campañas. </w:t>
+                </w:r>
+              </w:p>
+            </w:tc>
+          </w:tr>
+          <w:tr>
+            <w:trPr>
+              <w:cantSplit w:val="0"/>
+              <w:trHeight w:val="240" w:hRule="atLeast"/>
+              <w:tblHeader w:val="0"/>
+            </w:trPr>
+            <w:tc>
+              <w:tcPr/>
+              <w:p>
+                <w:pPr>
+                  <w:rPr/>
+                </w:pPr>
+                <w:r>
+                  <w:rPr>
+                    <w:b w:val="1"/>
+                    <w:bCs w:val="1"/>
+                    <w:rtl w:val="0"/>
+                  </w:rPr>
+                  <w:t xml:space="preserve">Descripción</w:t>
+                </w:r>
+                <w:r>
+                  <w:rPr>
+                    <w:rtl w:val="0"/>
+                  </w:rPr>
+                </w:r>
+              </w:p>
+            </w:tc>
+            <w:tc>
+              <w:tcPr>
+                <w:gridSpan w:val="2"/>
+              </w:tcPr>
+              <w:p>
+                <w:pPr>
+                  <w:rPr/>
+                </w:pPr>
+                <w:r>
+                  <w:rPr>
+                    <w:rtl w:val="0"/>
+                  </w:rPr>
+                  <w:t xml:space="preserve">Se incluye en Orquestar y ejecutar pipelines diarios. Corresponde a la lectura y transformación de los eventos de navegación generados en los sitios de los tenants, que ingresan al ambiente mediante exportación nativa y no mediante extracción por endpoint, para su posterior cruce con las demás fuentes. </w:t>
+                </w:r>
+              </w:p>
+            </w:tc>
+          </w:tr>
+        </w:tbl>
+      </w:sdtContent>
+    </w:sdt>
+    <w:p>
+      <w:pPr>
+        <w:widowControl w:val="0"/>
+        <w:spacing w:after="0" w:line="276" w:lineRule="auto"/>
+        <w:rPr/>
+      </w:pPr>
+      <w:r>
+        <w:rPr>
+          <w:rtl w:val="0"/>
+        </w:rPr>
+      </w:r>
+    </w:p>
+    <w:p>
+      <w:pPr>
+        <w:rPr/>
+      </w:pPr>
+      <w:r>
+        <w:rPr>
+          <w:rtl w:val="0"/>
+        </w:rPr>
+      </w:r>
+    </w:p>
+    <w:p>
+      <w:pPr>
+        <w:rPr>
+          <w:b w:val="1"/>
+          <w:bCs w:val="1"/>
+        </w:rPr>
+      </w:pPr>
+      <w:r>
+        <w:br w:type="page"/>
+      </w:r>
+      <w:r>
+        <w:rPr>
+          <w:rtl w:val="0"/>
+        </w:rPr>
+      </w:r>
+    </w:p>
+    <w:p>
+      <w:pPr>
+        <w:rPr>
+          <w:b w:val="1"/>
+          <w:bCs w:val="1"/>
+        </w:rPr>
+      </w:pPr>
+      <w:r>
+        <w:rPr>
+          <w:b w:val="1"/>
+          <w:bCs w:val="1"/>
+          <w:rtl w:val="0"/>
+        </w:rPr>
+        <w:t xml:space="preserve">Incorporar nuevo tenant</w:t>
+      </w:r>
+    </w:p>
+    <w:sdt>
+      <w:sdtPr>
+        <w:lock w:val="contentLocked"/>
+        <w:id w:val="-573192046"/>
+        <w:tag w:val="goog_rdk_3"/>
+      </w:sdtPr>
+      <w:sdtContent>
+        <w:tbl>
+          <w:tblPr>
+            <w:tblStyle w:val="Table22"/>
+            <w:tblW w:w="8820.0" w:type="dxa"/>
+            <w:jc w:val="left"/>
+            <w:tblBorders>
+              <w:top w:color="000000" w:space="0" w:sz="8" w:val="single"/>
+              <w:left w:color="000000" w:space="0" w:sz="8" w:val="single"/>
+              <w:bottom w:color="000000" w:space="0" w:sz="8" w:val="single"/>
+              <w:right w:color="000000" w:space="0" w:sz="8" w:val="single"/>
+              <w:insideH w:color="000000" w:space="0" w:sz="8" w:val="single"/>
+              <w:insideV w:color="000000" w:space="0" w:sz="8" w:val="single"/>
+            </w:tblBorders>
+            <w:tblLayout w:type="fixed"/>
+            <w:tblLook w:val="0400"/>
+          </w:tblPr>
+          <w:tblGrid>
+            <w:gridCol w:w="1995"/>
+            <w:gridCol w:w="3885"/>
+            <w:gridCol w:w="2940"/>
+            <w:tblGridChange w:id="0">
+              <w:tblGrid>
+                <w:gridCol w:w="1995"/>
+                <w:gridCol w:w="3885"/>
+                <w:gridCol w:w="2940"/>
+              </w:tblGrid>
+            </w:tblGridChange>
+          </w:tblGrid>
+          <w:tr>
+            <w:trPr>
+              <w:cantSplit w:val="0"/>
+              <w:tblHeader w:val="0"/>
+            </w:trPr>
+            <w:tc>
+              <w:tcPr/>
+              <w:p>
+                <w:pPr>
+                  <w:rPr/>
+                </w:pPr>
+                <w:r>
+                  <w:rPr>
+                    <w:b w:val="1"/>
+                    <w:bCs w:val="1"/>
+                    <w:rtl w:val="0"/>
+                  </w:rPr>
+                  <w:t xml:space="preserve">Caso de Uso</w:t>
+                </w:r>
+                <w:r>
+                  <w:rPr>
+                    <w:rtl w:val="0"/>
+                  </w:rPr>
+                </w:r>
+              </w:p>
+            </w:tc>
+            <w:tc>
+              <w:tcPr/>
+              <w:p>
+                <w:pPr>
+                  <w:rPr/>
+                </w:pPr>
+                <w:r>
+                  <w:rPr>
+                    <w:rtl w:val="0"/>
+                  </w:rPr>
+                  <w:t xml:space="preserve">Incorporar nuevo tenant </w:t>
+                </w:r>
+              </w:p>
+            </w:tc>
+            <w:tc>
+              <w:tcPr/>
+              <w:p>
+                <w:pPr>
+                  <w:rPr/>
+                </w:pPr>
+                <w:r>
+                  <w:rPr>
+                    <w:rtl w:val="0"/>
+                  </w:rPr>
+                  <w:t xml:space="preserve">Identificador:</w:t>
+                  <w:br w:type="textWrapping"/>
+                  <w:t xml:space="preserve">C16</w:t>
+                </w:r>
+              </w:p>
+            </w:tc>
+          </w:tr>
+          <w:tr>
+            <w:trPr>
+              <w:cantSplit w:val="0"/>
+              <w:trHeight w:val="240" w:hRule="atLeast"/>
+              <w:tblHeader w:val="0"/>
+            </w:trPr>
+            <w:tc>
+              <w:tcPr/>
+              <w:p>
+                <w:pPr>
+                  <w:rPr/>
+                </w:pPr>
+                <w:r>
+                  <w:rPr>
+                    <w:b w:val="1"/>
+                    <w:bCs w:val="1"/>
+                    <w:rtl w:val="0"/>
+                  </w:rPr>
+                  <w:t xml:space="preserve">Actores</w:t>
+                </w:r>
+                <w:r>
+                  <w:rPr>
+                    <w:rtl w:val="0"/>
+                  </w:rPr>
+                </w:r>
+              </w:p>
+            </w:tc>
+            <w:tc>
+              <w:tcPr>
+                <w:gridSpan w:val="2"/>
+              </w:tcPr>
+              <w:p>
+                <w:pPr>
+                  <w:rPr/>
+                </w:pPr>
+                <w:r>
+                  <w:rPr>
+                    <w:rtl w:val="0"/>
+                  </w:rPr>
+                  <w:t xml:space="preserve">ACT-01 (a través de C04)</w:t>
+                </w:r>
+              </w:p>
+            </w:tc>
+          </w:tr>
+          <w:tr>
+            <w:trPr>
+              <w:cantSplit w:val="0"/>
+              <w:trHeight w:val="240" w:hRule="atLeast"/>
+              <w:tblHeader w:val="0"/>
+            </w:trPr>
+            <w:tc>
+              <w:tcPr/>
+              <w:p>
+                <w:pPr>
+                  <w:rPr/>
+                </w:pPr>
+                <w:r>
+                  <w:rPr>
+                    <w:b w:val="1"/>
+                    <w:bCs w:val="1"/>
+                    <w:rtl w:val="0"/>
+                  </w:rPr>
+                  <w:t xml:space="preserve">Tipo</w:t>
+                </w:r>
+                <w:r>
+                  <w:rPr>
+                    <w:rtl w:val="0"/>
+                  </w:rPr>
+                </w:r>
+              </w:p>
+            </w:tc>
+            <w:tc>
+              <w:tcPr>
+                <w:gridSpan w:val="2"/>
+              </w:tcPr>
+              <w:p>
+                <w:pPr>
+                  <w:rPr/>
+                </w:pPr>
+                <w:r>
+                  <w:rPr>
+                    <w:rtl w:val="0"/>
+                  </w:rPr>
+                  <w:t xml:space="preserve">Secundario 1er nivel (Extend)  </w:t>
+                </w:r>
+              </w:p>
+            </w:tc>
+          </w:tr>
+          <w:tr>
+            <w:trPr>
+              <w:cantSplit w:val="0"/>
+              <w:trHeight w:val="240" w:hRule="atLeast"/>
+              <w:tblHeader w:val="0"/>
+            </w:trPr>
+            <w:tc>
+              <w:tcPr/>
+              <w:p>
+                <w:pPr>
+                  <w:rPr/>
+                </w:pPr>
+                <w:r>
+                  <w:rPr>
+                    <w:b w:val="1"/>
+                    <w:bCs w:val="1"/>
+                    <w:rtl w:val="0"/>
+                  </w:rPr>
+                  <w:t xml:space="preserve">Referencias</w:t>
+                </w:r>
+                <w:r>
+                  <w:rPr>
+                    <w:rtl w:val="0"/>
+                  </w:rPr>
+                </w:r>
+              </w:p>
+            </w:tc>
+            <w:tc>
+              <w:tcPr>
+                <w:gridSpan w:val="2"/>
+              </w:tcPr>
+              <w:p>
+                <w:pPr>
+                  <w:rPr/>
+                </w:pPr>
+                <w:r>
+                  <w:rPr>
+                    <w:rtl w:val="0"/>
+                  </w:rPr>
+                  <w:t xml:space="preserve">C04</w:t>
+                </w:r>
+              </w:p>
+            </w:tc>
+          </w:tr>
+          <w:tr>
+            <w:trPr>
+              <w:cantSplit w:val="0"/>
+              <w:trHeight w:val="240" w:hRule="atLeast"/>
+              <w:tblHeader w:val="0"/>
+            </w:trPr>
+            <w:tc>
+              <w:tcPr/>
+              <w:p>
+                <w:pPr>
+                  <w:rPr/>
+                </w:pPr>
+                <w:r>
+                  <w:rPr>
+                    <w:b w:val="1"/>
+                    <w:bCs w:val="1"/>
+                    <w:rtl w:val="0"/>
+                  </w:rPr>
+                  <w:t xml:space="preserve">Precondición</w:t>
+                </w:r>
+                <w:r>
+                  <w:rPr>
+                    <w:rtl w:val="0"/>
+                  </w:rPr>
+                </w:r>
+              </w:p>
+            </w:tc>
+            <w:tc>
+              <w:tcPr>
+                <w:gridSpan w:val="2"/>
+              </w:tcPr>
+              <w:p>
+                <w:pPr>
+                  <w:rPr/>
+                </w:pPr>
+                <w:r>
+                  <w:rPr>
+                    <w:rtl w:val="0"/>
+                  </w:rPr>
+                  <w:t xml:space="preserve">Credenciales de acceso a las fuentes del nuevo cliente entregadas; permisos de administración en IAM y en DBT. </w:t>
+                </w:r>
+              </w:p>
+            </w:tc>
+          </w:tr>
+          <w:tr>
+            <w:trPr>
+              <w:cantSplit w:val="0"/>
+              <w:trHeight w:val="240" w:hRule="atLeast"/>
+              <w:tblHeader w:val="0"/>
+            </w:trPr>
+            <w:tc>
+              <w:tcPr/>
+              <w:p>
+                <w:pPr>
+                  <w:rPr/>
+                </w:pPr>
+                <w:r>
+                  <w:rPr>
+                    <w:b w:val="1"/>
+                    <w:bCs w:val="1"/>
+                    <w:rtl w:val="0"/>
+                  </w:rPr>
+                  <w:t xml:space="preserve">Postcondición</w:t>
+                </w:r>
+                <w:r>
+                  <w:rPr>
+                    <w:rtl w:val="0"/>
+                  </w:rPr>
+                </w:r>
+              </w:p>
+            </w:tc>
+            <w:tc>
+              <w:tcPr>
+                <w:gridSpan w:val="2"/>
+              </w:tcPr>
+              <w:p>
+                <w:pPr>
+                  <w:rPr/>
+                </w:pPr>
+                <w:r>
+                  <w:rPr>
+                    <w:rtl w:val="0"/>
+                  </w:rPr>
+                  <w:t xml:space="preserve">Nuevo tenant operativo en la plataforma, con sus datos aislados del resto y su tablero habilitado. </w:t>
+                </w:r>
+              </w:p>
+            </w:tc>
+          </w:tr>
+          <w:tr>
+            <w:trPr>
+              <w:cantSplit w:val="0"/>
+              <w:trHeight w:val="240" w:hRule="atLeast"/>
+              <w:tblHeader w:val="0"/>
+            </w:trPr>
+            <w:tc>
+              <w:tcPr/>
+              <w:p>
+                <w:pPr>
+                  <w:rPr/>
+                </w:pPr>
+                <w:r>
+                  <w:rPr>
+                    <w:b w:val="1"/>
+                    <w:bCs w:val="1"/>
+                    <w:rtl w:val="0"/>
+                  </w:rPr>
+                  <w:t xml:space="preserve">Descripción</w:t>
+                </w:r>
+                <w:r>
+                  <w:rPr>
+                    <w:rtl w:val="0"/>
+                  </w:rPr>
+                </w:r>
+              </w:p>
+            </w:tc>
+            <w:tc>
+              <w:tcPr>
+                <w:gridSpan w:val="2"/>
+              </w:tcPr>
+              <w:p>
+                <w:pPr>
+                  <w:rPr/>
+                </w:pPr>
+                <w:r>
+                  <w:rPr>
+                    <w:rtl w:val="0"/>
+                  </w:rPr>
+                  <w:t xml:space="preserve">Habilitación de un nuevo cliente sobre la arquitectura existente. Comprende el registro de credenciales, la asignación de su identificador de tenant, el despliegue de sus pipelines, la creación de las vistas de preparación propias de su estructura de origen y la aplicación de las políticas de seguridad a nivel de fila que garantizan su compartimentación. </w:t>
+                </w:r>
+              </w:p>
+            </w:tc>
+          </w:tr>
+        </w:tbl>
+      </w:sdtContent>
+    </w:sdt>
+    <w:p>
+      <w:pPr>
+        <w:widowControl w:val="0"/>
+        <w:spacing w:after="0" w:line="276" w:lineRule="auto"/>
+        <w:rPr/>
+      </w:pPr>
+      <w:r>
+        <w:rPr>
+          <w:rtl w:val="0"/>
+        </w:rPr>
+      </w:r>
+    </w:p>
+    <w:p>
+      <w:pPr>
+        <w:rPr/>
+      </w:pPr>
+      <w:r>
+        <w:rPr>
+          <w:rtl w:val="0"/>
+        </w:rPr>
+      </w:r>
+    </w:p>
+    <w:p>
+      <w:pPr>
+        <w:rPr>
+          <w:b w:val="1"/>
+          <w:bCs w:val="1"/>
+        </w:rPr>
+      </w:pPr>
+      <w:r>
+        <w:br w:type="page"/>
+      </w:r>
+      <w:r>
+        <w:rPr>
+          <w:rtl w:val="0"/>
+        </w:rPr>
+      </w:r>
+    </w:p>
+    <w:p>
+      <w:pPr>
+        <w:rPr>
+          <w:b w:val="1"/>
+          <w:bCs w:val="1"/>
+        </w:rPr>
+      </w:pPr>
+      <w:r>
+        <w:rPr>
+          <w:b w:val="1"/>
+          <w:bCs w:val="1"/>
+          <w:rtl w:val="0"/>
+        </w:rPr>
+        <w:t xml:space="preserve">Ejecutar carga histórica de datos</w:t>
+      </w:r>
+    </w:p>
+    <w:sdt>
+      <w:sdtPr>
+        <w:lock w:val="contentLocked"/>
+        <w:id w:val="-411831512"/>
+        <w:tag w:val="goog_rdk_4"/>
+      </w:sdtPr>
+      <w:sdtContent>
+        <w:tbl>
+          <w:tblPr>
+            <w:tblStyle w:val="Table23"/>
+            <w:tblW w:w="8820.0" w:type="dxa"/>
+            <w:jc w:val="left"/>
+            <w:tblBorders>
+              <w:top w:color="000000" w:space="0" w:sz="8" w:val="single"/>
+              <w:left w:color="000000" w:space="0" w:sz="8" w:val="single"/>
+              <w:bottom w:color="000000" w:space="0" w:sz="8" w:val="single"/>
+              <w:right w:color="000000" w:space="0" w:sz="8" w:val="single"/>
+              <w:insideH w:color="000000" w:space="0" w:sz="8" w:val="single"/>
+              <w:insideV w:color="000000" w:space="0" w:sz="8" w:val="single"/>
+            </w:tblBorders>
+            <w:tblLayout w:type="fixed"/>
+            <w:tblLook w:val="0400"/>
+          </w:tblPr>
+          <w:tblGrid>
+            <w:gridCol w:w="1995"/>
+            <w:gridCol w:w="3885"/>
+            <w:gridCol w:w="2940"/>
+            <w:tblGridChange w:id="0">
+              <w:tblGrid>
+                <w:gridCol w:w="1995"/>
+                <w:gridCol w:w="3885"/>
+                <w:gridCol w:w="2940"/>
+              </w:tblGrid>
+            </w:tblGridChange>
+          </w:tblGrid>
+          <w:tr>
+            <w:trPr>
+              <w:cantSplit w:val="0"/>
+              <w:tblHeader w:val="0"/>
+            </w:trPr>
+            <w:tc>
+              <w:tcPr/>
+              <w:p>
+                <w:pPr>
+                  <w:rPr/>
+                </w:pPr>
+                <w:r>
+                  <w:rPr>
+                    <w:b w:val="1"/>
+                    <w:bCs w:val="1"/>
+                    <w:rtl w:val="0"/>
+                  </w:rPr>
+                  <w:t xml:space="preserve">Caso de Uso</w:t>
+                </w:r>
+                <w:r>
+                  <w:rPr>
+                    <w:rtl w:val="0"/>
+                  </w:rPr>
+                </w:r>
+              </w:p>
+            </w:tc>
+            <w:tc>
+              <w:tcPr/>
+              <w:p>
+                <w:pPr>
+                  <w:rPr/>
+                </w:pPr>
+                <w:r>
+                  <w:rPr>
+                    <w:rtl w:val="0"/>
+                  </w:rPr>
+                  <w:t xml:space="preserve">Ejecutar carga histórica de datos </w:t>
+                </w:r>
+              </w:p>
+            </w:tc>
+            <w:tc>
+              <w:tcPr/>
+              <w:p>
+                <w:pPr>
+                  <w:rPr/>
+                </w:pPr>
+                <w:r>
+                  <w:rPr>
+                    <w:rtl w:val="0"/>
+                  </w:rPr>
+                  <w:t xml:space="preserve">Identificador:</w:t>
+                  <w:br w:type="textWrapping"/>
+                  <w:t xml:space="preserve">C17</w:t>
+                </w:r>
+              </w:p>
+            </w:tc>
+          </w:tr>
+          <w:tr>
+            <w:trPr>
+              <w:cantSplit w:val="0"/>
+              <w:trHeight w:val="202.37304687500003" w:hRule="atLeast"/>
+              <w:tblHeader w:val="0"/>
+            </w:trPr>
+            <w:tc>
+              <w:tcPr/>
+              <w:p>
+                <w:pPr>
+                  <w:rPr/>
+                </w:pPr>
+                <w:r>
+                  <w:rPr>
+                    <w:b w:val="1"/>
+                    <w:bCs w:val="1"/>
+                    <w:rtl w:val="0"/>
+                  </w:rPr>
+                  <w:t xml:space="preserve">Actores</w:t>
+                </w:r>
+                <w:r>
+                  <w:rPr>
+                    <w:rtl w:val="0"/>
+                  </w:rPr>
+                </w:r>
+              </w:p>
+            </w:tc>
+            <w:tc>
+              <w:tcPr>
+                <w:gridSpan w:val="2"/>
+              </w:tcPr>
+              <w:p>
+                <w:pPr>
+                  <w:rPr/>
+                </w:pPr>
+                <w:r>
+                  <w:rPr>
+                    <w:rtl w:val="0"/>
+                  </w:rPr>
+                  <w:t xml:space="preserve">ACT-01 (a través de C04)</w:t>
+                </w:r>
+              </w:p>
+            </w:tc>
+          </w:tr>
+          <w:tr>
+            <w:trPr>
+              <w:cantSplit w:val="0"/>
+              <w:trHeight w:val="240" w:hRule="atLeast"/>
+              <w:tblHeader w:val="0"/>
+            </w:trPr>
+            <w:tc>
+              <w:tcPr/>
+              <w:p>
+                <w:pPr>
+                  <w:rPr/>
+                </w:pPr>
+                <w:r>
+                  <w:rPr>
+                    <w:b w:val="1"/>
+                    <w:bCs w:val="1"/>
+                    <w:rtl w:val="0"/>
+                  </w:rPr>
+                  <w:t xml:space="preserve">Tipo</w:t>
+                </w:r>
+                <w:r>
+                  <w:rPr>
+                    <w:rtl w:val="0"/>
+                  </w:rPr>
+                </w:r>
+              </w:p>
+            </w:tc>
+            <w:tc>
+              <w:tcPr>
+                <w:gridSpan w:val="2"/>
+              </w:tcPr>
+              <w:p>
+                <w:pPr>
+                  <w:rPr/>
+                </w:pPr>
+                <w:r>
+                  <w:rPr>
+                    <w:rtl w:val="0"/>
+                  </w:rPr>
+                  <w:t xml:space="preserve">Secundario 1er nivel (Extend)  </w:t>
+                </w:r>
+              </w:p>
+            </w:tc>
+          </w:tr>
+          <w:tr>
+            <w:trPr>
+              <w:cantSplit w:val="0"/>
+              <w:trHeight w:val="240" w:hRule="atLeast"/>
+              <w:tblHeader w:val="0"/>
+            </w:trPr>
+            <w:tc>
+              <w:tcPr/>
+              <w:p>
+                <w:pPr>
+                  <w:rPr/>
+                </w:pPr>
+                <w:r>
+                  <w:rPr>
+                    <w:b w:val="1"/>
+                    <w:bCs w:val="1"/>
+                    <w:rtl w:val="0"/>
+                  </w:rPr>
+                  <w:t xml:space="preserve">Referencias</w:t>
+                </w:r>
+                <w:r>
+                  <w:rPr>
+                    <w:rtl w:val="0"/>
+                  </w:rPr>
+                </w:r>
+              </w:p>
+            </w:tc>
+            <w:tc>
+              <w:tcPr>
+                <w:gridSpan w:val="2"/>
+              </w:tcPr>
+              <w:p>
+                <w:pPr>
+                  <w:rPr/>
+                </w:pPr>
+                <w:r>
+                  <w:rPr>
+                    <w:rtl w:val="0"/>
+                  </w:rPr>
+                  <w:t xml:space="preserve">C04</w:t>
+                </w:r>
+              </w:p>
+            </w:tc>
+          </w:tr>
+          <w:tr>
+            <w:trPr>
+              <w:cantSplit w:val="0"/>
+              <w:trHeight w:val="240" w:hRule="atLeast"/>
+              <w:tblHeader w:val="0"/>
+            </w:trPr>
+            <w:tc>
+              <w:tcPr/>
+              <w:p>
+                <w:pPr>
+                  <w:rPr/>
+                </w:pPr>
+                <w:r>
+                  <w:rPr>
+                    <w:b w:val="1"/>
+                    <w:bCs w:val="1"/>
+                    <w:rtl w:val="0"/>
+                  </w:rPr>
+                  <w:t xml:space="preserve">Precondición</w:t>
+                </w:r>
+                <w:r>
+                  <w:rPr>
+                    <w:rtl w:val="0"/>
+                  </w:rPr>
+                </w:r>
+              </w:p>
+            </w:tc>
+            <w:tc>
+              <w:tcPr>
+                <w:gridSpan w:val="2"/>
+              </w:tcPr>
+              <w:p>
+                <w:pPr>
+                  <w:rPr/>
+                </w:pPr>
+                <w:r>
+                  <w:rPr>
+                    <w:rtl w:val="0"/>
+                  </w:rPr>
+                  <w:t xml:space="preserve">Pipeline del tenant desplegado y operativo; rango histórico a recuperar definido. </w:t>
+                </w:r>
+              </w:p>
+            </w:tc>
+          </w:tr>
+          <w:tr>
+            <w:trPr>
+              <w:cantSplit w:val="0"/>
+              <w:trHeight w:val="240" w:hRule="atLeast"/>
+              <w:tblHeader w:val="0"/>
+            </w:trPr>
+            <w:tc>
+              <w:tcPr/>
+              <w:p>
+                <w:pPr>
+                  <w:rPr/>
+                </w:pPr>
+                <w:r>
+                  <w:rPr>
+                    <w:b w:val="1"/>
+                    <w:bCs w:val="1"/>
+                    <w:rtl w:val="0"/>
+                  </w:rPr>
+                  <w:t xml:space="preserve">Postcondición</w:t>
+                </w:r>
+                <w:r>
+                  <w:rPr>
+                    <w:rtl w:val="0"/>
+                  </w:rPr>
+                </w:r>
+              </w:p>
+            </w:tc>
+            <w:tc>
+              <w:tcPr>
+                <w:gridSpan w:val="2"/>
+              </w:tcPr>
+              <w:p>
+                <w:pPr>
+                  <w:rPr/>
+                </w:pPr>
+                <w:r>
+                  <w:rPr>
+                    <w:rtl w:val="0"/>
+                  </w:rPr>
+                  <w:t xml:space="preserve">Historial del tenant cargado en las capas Medallion y validado contra la fuente de origen. </w:t>
+                </w:r>
+              </w:p>
+            </w:tc>
+          </w:tr>
+          <w:tr>
+            <w:trPr>
+              <w:cantSplit w:val="0"/>
+              <w:trHeight w:val="240" w:hRule="atLeast"/>
+              <w:tblHeader w:val="0"/>
+            </w:trPr>
+            <w:tc>
+              <w:tcPr/>
+              <w:p>
+                <w:pPr>
+                  <w:rPr/>
+                </w:pPr>
+                <w:r>
+                  <w:rPr>
+                    <w:b w:val="1"/>
+                    <w:bCs w:val="1"/>
+                    <w:rtl w:val="0"/>
+                  </w:rPr>
+                  <w:t xml:space="preserve">Descripción</w:t>
+                </w:r>
+                <w:r>
+                  <w:rPr>
+                    <w:rtl w:val="0"/>
+                  </w:rPr>
+                </w:r>
+              </w:p>
+            </w:tc>
+            <w:tc>
+              <w:tcPr>
+                <w:gridSpan w:val="2"/>
+              </w:tcPr>
+              <w:p>
+                <w:pPr>
+                  <w:rPr/>
+                </w:pPr>
+                <w:r>
+                  <w:rPr>
+                    <w:rtl w:val="0"/>
+                  </w:rPr>
+                  <w:t xml:space="preserve">Extiende la gestión de pipelines mediante una ejecución en modo histórico, que recorre un rango temporal extenso dividido en bloques acotados para respetar los límites de respuesta de las fuentes. Cada bloque se carga, transforma y valida de forma independiente antes de avanzar al siguiente. </w:t>
+                </w:r>
+              </w:p>
+            </w:tc>
+          </w:tr>
+        </w:tbl>
+      </w:sdtContent>
+    </w:sdt>
+    <w:p>
+      <w:pPr>
+        <w:widowControl w:val="0"/>
+        <w:spacing w:after="0" w:line="276" w:lineRule="auto"/>
         <w:rPr/>
       </w:pPr>
       <w:r>
@@ -13378,6 +14704,153 @@
       <w:tcPr/>
     </w:tblStylePr>
   </w:style>
+  <w:style w:type="table" w:styleId="Table21">
+    <w:basedOn w:val="TableNormal"/>
+    <w:tblPr>
+      <w:tblStyleRowBandSize w:val="1"/>
+      <w:tblStyleColBandSize w:val="1"/>
+      <w:tblCellMar>
+        <w:top w:w="0.0" w:type="dxa"/>
+        <w:left w:w="108.0" w:type="dxa"/>
+        <w:bottom w:w="0.0" w:type="dxa"/>
+        <w:right w:w="108.0" w:type="dxa"/>
+      </w:tblCellMar>
+    </w:tblPr>
+    <w:tblStylePr w:type="band1Horz">
+      <w:tcPr/>
+    </w:tblStylePr>
+    <w:tblStylePr w:type="band1Vert">
+      <w:tcPr/>
+    </w:tblStylePr>
+    <w:tblStylePr w:type="band2Horz">
+      <w:tcPr/>
+    </w:tblStylePr>
+    <w:tblStylePr w:type="band2Vert">
+      <w:tcPr/>
+    </w:tblStylePr>
+    <w:tblStylePr w:type="firstCol">
+      <w:tcPr/>
+    </w:tblStylePr>
+    <w:tblStylePr w:type="firstRow">
+      <w:tcPr/>
+    </w:tblStylePr>
+    <w:tblStylePr w:type="lastCol">
+      <w:tcPr/>
+    </w:tblStylePr>
+    <w:tblStylePr w:type="lastRow">
+      <w:tcPr/>
+    </w:tblStylePr>
+    <w:tblStylePr w:type="neCell">
+      <w:tcPr/>
+    </w:tblStylePr>
+    <w:tblStylePr w:type="nwCell">
+      <w:tcPr/>
+    </w:tblStylePr>
+    <w:tblStylePr w:type="seCell">
+      <w:tcPr/>
+    </w:tblStylePr>
+    <w:tblStylePr w:type="swCell">
+      <w:tcPr/>
+    </w:tblStylePr>
+  </w:style>
+  <w:style w:type="table" w:styleId="Table22">
+    <w:basedOn w:val="TableNormal"/>
+    <w:tblPr>
+      <w:tblStyleRowBandSize w:val="1"/>
+      <w:tblStyleColBandSize w:val="1"/>
+      <w:tblCellMar>
+        <w:top w:w="0.0" w:type="dxa"/>
+        <w:left w:w="108.0" w:type="dxa"/>
+        <w:bottom w:w="0.0" w:type="dxa"/>
+        <w:right w:w="108.0" w:type="dxa"/>
+      </w:tblCellMar>
+    </w:tblPr>
+    <w:tblStylePr w:type="band1Horz">
+      <w:tcPr/>
+    </w:tblStylePr>
+    <w:tblStylePr w:type="band1Vert">
+      <w:tcPr/>
+    </w:tblStylePr>
+    <w:tblStylePr w:type="band2Horz">
+      <w:tcPr/>
+    </w:tblStylePr>
+    <w:tblStylePr w:type="band2Vert">
+      <w:tcPr/>
+    </w:tblStylePr>
+    <w:tblStylePr w:type="firstCol">
+      <w:tcPr/>
+    </w:tblStylePr>
+    <w:tblStylePr w:type="firstRow">
+      <w:tcPr/>
+    </w:tblStylePr>
+    <w:tblStylePr w:type="lastCol">
+      <w:tcPr/>
+    </w:tblStylePr>
+    <w:tblStylePr w:type="lastRow">
+      <w:tcPr/>
+    </w:tblStylePr>
+    <w:tblStylePr w:type="neCell">
+      <w:tcPr/>
+    </w:tblStylePr>
+    <w:tblStylePr w:type="nwCell">
+      <w:tcPr/>
+    </w:tblStylePr>
+    <w:tblStylePr w:type="seCell">
+      <w:tcPr/>
+    </w:tblStylePr>
+    <w:tblStylePr w:type="swCell">
+      <w:tcPr/>
+    </w:tblStylePr>
+  </w:style>
+  <w:style w:type="table" w:styleId="Table23">
+    <w:basedOn w:val="TableNormal"/>
+    <w:tblPr>
+      <w:tblStyleRowBandSize w:val="1"/>
+      <w:tblStyleColBandSize w:val="1"/>
+      <w:tblCellMar>
+        <w:top w:w="0.0" w:type="dxa"/>
+        <w:left w:w="108.0" w:type="dxa"/>
+        <w:bottom w:w="0.0" w:type="dxa"/>
+        <w:right w:w="108.0" w:type="dxa"/>
+      </w:tblCellMar>
+    </w:tblPr>
+    <w:tblStylePr w:type="band1Horz">
+      <w:tcPr/>
+    </w:tblStylePr>
+    <w:tblStylePr w:type="band1Vert">
+      <w:tcPr/>
+    </w:tblStylePr>
+    <w:tblStylePr w:type="band2Horz">
+      <w:tcPr/>
+    </w:tblStylePr>
+    <w:tblStylePr w:type="band2Vert">
+      <w:tcPr/>
+    </w:tblStylePr>
+    <w:tblStylePr w:type="firstCol">
+      <w:tcPr/>
+    </w:tblStylePr>
+    <w:tblStylePr w:type="firstRow">
+      <w:tcPr/>
+    </w:tblStylePr>
+    <w:tblStylePr w:type="lastCol">
+      <w:tcPr/>
+    </w:tblStylePr>
+    <w:tblStylePr w:type="lastRow">
+      <w:tcPr/>
+    </w:tblStylePr>
+    <w:tblStylePr w:type="neCell">
+      <w:tcPr/>
+    </w:tblStylePr>
+    <w:tblStylePr w:type="nwCell">
+      <w:tcPr/>
+    </w:tblStylePr>
+    <w:tblStylePr w:type="seCell">
+      <w:tcPr/>
+    </w:tblStylePr>
+    <w:tblStylePr w:type="swCell">
+      <w:tcPr/>
+    </w:tblStylePr>
+  </w:style>
 </w:styles>
 </file>
 
@@ -13703,7 +15176,7 @@
 
 <file path=customXML/item1.xml><?xml version="1.0" encoding="utf-8"?>
 <go:gDocsCustomXmlDataStorage xmlns:go="http://customooxmlschemas.google.com/" xmlns:r="http://schemas.openxmlformats.org/officeDocument/2006/relationships" uri="GoogleDocsCustomDataVersion2">
-  <go:docsCustomData xmlns:go="http://customooxmlschemas.google.com/" roundtripDataSignature="AMtx7mgpmz3r1wn/gwVRA1dG4qdy7xa3YA==">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</go:docsCustomData>
+  <go:docsCustomData xmlns:go="http://customooxmlschemas.google.com/" roundtripDataSignature="AMtx7mhde6hvVdS5IrLtzjeaY5A7ElDY8A==">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</go:docsCustomData>
 </go:gDocsCustomXmlDataStorage>
 </file>
 

</xml_diff>